<commit_message>
FORMULARIO CAMILA SANDOVAL-no pude subirlo por problemas en mi compu
</commit_message>
<xml_diff>
--- a/Cortes/Corte 3/Formularios LOGT 3/CamilaSandoval.docx
+++ b/Cortes/Corte 3/Formularios LOGT 3/CamilaSandoval.docx
@@ -27,13 +27,13 @@
         <w:tblLook w:val="04A0" w:firstRow="1" w:lastRow="0" w:firstColumn="1" w:lastColumn="0" w:noHBand="0" w:noVBand="1"/>
       </w:tblPr>
       <w:tblGrid>
-        <w:gridCol w:w="864"/>
+        <w:gridCol w:w="865"/>
         <w:gridCol w:w="808"/>
         <w:gridCol w:w="785"/>
-        <w:gridCol w:w="1814"/>
-        <w:gridCol w:w="1149"/>
+        <w:gridCol w:w="1823"/>
+        <w:gridCol w:w="1154"/>
         <w:gridCol w:w="713"/>
-        <w:gridCol w:w="2695"/>
+        <w:gridCol w:w="2680"/>
       </w:tblGrid>
       <w:tr>
         <w:trPr>
@@ -278,7 +278,15 @@
                 <w:bCs/>
                 <w:highlight w:val="yellow"/>
               </w:rPr>
-              <w:t>24/02</w:t>
+              <w:t>15</w:t>
+            </w:r>
+            <w:r>
+              <w:rPr>
+                <w:b/>
+                <w:bCs/>
+                <w:highlight w:val="yellow"/>
+              </w:rPr>
+              <w:t>/03</w:t>
             </w:r>
           </w:p>
         </w:tc>
@@ -312,7 +320,7 @@
                 <w:bCs/>
                 <w:highlight w:val="yellow"/>
               </w:rPr>
-              <w:t>23:00</w:t>
+              <w:t>20:00</w:t>
             </w:r>
           </w:p>
         </w:tc>
@@ -346,7 +354,7 @@
                 <w:bCs/>
                 <w:highlight w:val="yellow"/>
               </w:rPr>
-              <w:t>00:00</w:t>
+              <w:t>23:00</w:t>
             </w:r>
           </w:p>
         </w:tc>
@@ -458,6 +466,153 @@
                 <w:bCs/>
                 <w:highlight w:val="yellow"/>
               </w:rPr>
+              <w:t>Finalización de prototipos</w:t>
+            </w:r>
+          </w:p>
+        </w:tc>
+      </w:tr>
+      <w:tr>
+        <w:trPr>
+          <w:trHeight w:val="1002"/>
+        </w:trPr>
+        <w:tc>
+          <w:tcPr>
+            <w:tcW w:w="0" w:type="auto"/>
+            <w:tcBorders>
+              <w:top w:val="single" w:sz="4" w:space="0" w:color="000000"/>
+              <w:left w:val="single" w:sz="4" w:space="0" w:color="000000"/>
+              <w:bottom w:val="single" w:sz="4" w:space="0" w:color="000000"/>
+              <w:right w:val="single" w:sz="4" w:space="0" w:color="000000"/>
+            </w:tcBorders>
+            <w:tcMar>
+              <w:top w:w="100" w:type="dxa"/>
+              <w:left w:w="100" w:type="dxa"/>
+              <w:bottom w:w="100" w:type="dxa"/>
+              <w:right w:w="100" w:type="dxa"/>
+            </w:tcMar>
+          </w:tcPr>
+          <w:p>
+            <w:r>
+              <w:t>24/02</w:t>
+            </w:r>
+          </w:p>
+        </w:tc>
+        <w:tc>
+          <w:tcPr>
+            <w:tcW w:w="0" w:type="auto"/>
+            <w:tcBorders>
+              <w:top w:val="single" w:sz="4" w:space="0" w:color="000000"/>
+              <w:left w:val="single" w:sz="4" w:space="0" w:color="000000"/>
+              <w:bottom w:val="single" w:sz="4" w:space="0" w:color="000000"/>
+              <w:right w:val="single" w:sz="4" w:space="0" w:color="000000"/>
+            </w:tcBorders>
+            <w:tcMar>
+              <w:top w:w="100" w:type="dxa"/>
+              <w:left w:w="100" w:type="dxa"/>
+              <w:bottom w:w="100" w:type="dxa"/>
+              <w:right w:w="100" w:type="dxa"/>
+            </w:tcMar>
+          </w:tcPr>
+          <w:p>
+            <w:r>
+              <w:t>23:00</w:t>
+            </w:r>
+          </w:p>
+        </w:tc>
+        <w:tc>
+          <w:tcPr>
+            <w:tcW w:w="0" w:type="auto"/>
+            <w:tcBorders>
+              <w:top w:val="single" w:sz="4" w:space="0" w:color="000000"/>
+              <w:left w:val="single" w:sz="4" w:space="0" w:color="000000"/>
+              <w:bottom w:val="single" w:sz="4" w:space="0" w:color="000000"/>
+              <w:right w:val="single" w:sz="4" w:space="0" w:color="000000"/>
+            </w:tcBorders>
+            <w:tcMar>
+              <w:top w:w="100" w:type="dxa"/>
+              <w:left w:w="100" w:type="dxa"/>
+              <w:bottom w:w="100" w:type="dxa"/>
+              <w:right w:w="100" w:type="dxa"/>
+            </w:tcMar>
+          </w:tcPr>
+          <w:p>
+            <w:r>
+              <w:t>00:00</w:t>
+            </w:r>
+          </w:p>
+        </w:tc>
+        <w:tc>
+          <w:tcPr>
+            <w:tcW w:w="0" w:type="auto"/>
+            <w:tcBorders>
+              <w:top w:val="single" w:sz="4" w:space="0" w:color="000000"/>
+              <w:left w:val="single" w:sz="4" w:space="0" w:color="000000"/>
+              <w:bottom w:val="single" w:sz="4" w:space="0" w:color="000000"/>
+              <w:right w:val="single" w:sz="4" w:space="0" w:color="000000"/>
+            </w:tcBorders>
+            <w:tcMar>
+              <w:top w:w="100" w:type="dxa"/>
+              <w:left w:w="100" w:type="dxa"/>
+              <w:bottom w:w="100" w:type="dxa"/>
+              <w:right w:w="100" w:type="dxa"/>
+            </w:tcMar>
+          </w:tcPr>
+          <w:p/>
+        </w:tc>
+        <w:tc>
+          <w:tcPr>
+            <w:tcW w:w="0" w:type="auto"/>
+            <w:tcBorders>
+              <w:top w:val="single" w:sz="4" w:space="0" w:color="000000"/>
+              <w:left w:val="single" w:sz="4" w:space="0" w:color="000000"/>
+              <w:bottom w:val="single" w:sz="4" w:space="0" w:color="000000"/>
+              <w:right w:val="single" w:sz="4" w:space="0" w:color="000000"/>
+            </w:tcBorders>
+            <w:tcMar>
+              <w:top w:w="100" w:type="dxa"/>
+              <w:left w:w="100" w:type="dxa"/>
+              <w:bottom w:w="100" w:type="dxa"/>
+              <w:right w:w="100" w:type="dxa"/>
+            </w:tcMar>
+          </w:tcPr>
+          <w:p/>
+        </w:tc>
+        <w:tc>
+          <w:tcPr>
+            <w:tcW w:w="0" w:type="auto"/>
+            <w:tcBorders>
+              <w:top w:val="single" w:sz="4" w:space="0" w:color="000000"/>
+              <w:left w:val="single" w:sz="4" w:space="0" w:color="000000"/>
+              <w:bottom w:val="single" w:sz="4" w:space="0" w:color="000000"/>
+              <w:right w:val="single" w:sz="4" w:space="0" w:color="000000"/>
+            </w:tcBorders>
+            <w:tcMar>
+              <w:top w:w="100" w:type="dxa"/>
+              <w:left w:w="100" w:type="dxa"/>
+              <w:bottom w:w="100" w:type="dxa"/>
+              <w:right w:w="100" w:type="dxa"/>
+            </w:tcMar>
+          </w:tcPr>
+          <w:p/>
+        </w:tc>
+        <w:tc>
+          <w:tcPr>
+            <w:tcW w:w="0" w:type="auto"/>
+            <w:tcBorders>
+              <w:top w:val="single" w:sz="4" w:space="0" w:color="000000"/>
+              <w:left w:val="single" w:sz="4" w:space="0" w:color="000000"/>
+              <w:bottom w:val="single" w:sz="4" w:space="0" w:color="000000"/>
+              <w:right w:val="single" w:sz="4" w:space="0" w:color="000000"/>
+            </w:tcBorders>
+            <w:tcMar>
+              <w:top w:w="100" w:type="dxa"/>
+              <w:left w:w="100" w:type="dxa"/>
+              <w:bottom w:w="100" w:type="dxa"/>
+              <w:right w:w="100" w:type="dxa"/>
+            </w:tcMar>
+          </w:tcPr>
+          <w:p>
+            <w:r>
               <w:t>Actualización del UML</w:t>
             </w:r>
           </w:p>
@@ -1339,11 +1494,11 @@
     <w:name w:val="Normal"/>
     <w:qFormat/>
   </w:style>
-  <w:style w:type="paragraph" w:styleId="Heading1">
+  <w:style w:type="paragraph" w:styleId="Ttulo1">
     <w:name w:val="heading 1"/>
     <w:basedOn w:val="Normal"/>
     <w:next w:val="Normal"/>
-    <w:link w:val="Heading1Char"/>
+    <w:link w:val="Ttulo1Car"/>
     <w:uiPriority w:val="9"/>
     <w:qFormat/>
     <w:rsid w:val="004C32A8"/>
@@ -1360,11 +1515,11 @@
       <w:szCs w:val="40"/>
     </w:rPr>
   </w:style>
-  <w:style w:type="paragraph" w:styleId="Heading2">
+  <w:style w:type="paragraph" w:styleId="Ttulo2">
     <w:name w:val="heading 2"/>
     <w:basedOn w:val="Normal"/>
     <w:next w:val="Normal"/>
-    <w:link w:val="Heading2Char"/>
+    <w:link w:val="Ttulo2Car"/>
     <w:uiPriority w:val="9"/>
     <w:semiHidden/>
     <w:unhideWhenUsed/>
@@ -1383,11 +1538,11 @@
       <w:szCs w:val="32"/>
     </w:rPr>
   </w:style>
-  <w:style w:type="paragraph" w:styleId="Heading3">
+  <w:style w:type="paragraph" w:styleId="Ttulo3">
     <w:name w:val="heading 3"/>
     <w:basedOn w:val="Normal"/>
     <w:next w:val="Normal"/>
-    <w:link w:val="Heading3Char"/>
+    <w:link w:val="Ttulo3Car"/>
     <w:uiPriority w:val="9"/>
     <w:semiHidden/>
     <w:unhideWhenUsed/>
@@ -1406,11 +1561,11 @@
       <w:szCs w:val="28"/>
     </w:rPr>
   </w:style>
-  <w:style w:type="paragraph" w:styleId="Heading4">
+  <w:style w:type="paragraph" w:styleId="Ttulo4">
     <w:name w:val="heading 4"/>
     <w:basedOn w:val="Normal"/>
     <w:next w:val="Normal"/>
-    <w:link w:val="Heading4Char"/>
+    <w:link w:val="Ttulo4Car"/>
     <w:uiPriority w:val="9"/>
     <w:semiHidden/>
     <w:unhideWhenUsed/>
@@ -1429,11 +1584,11 @@
       <w:color w:val="0F4761" w:themeColor="accent1" w:themeShade="BF"/>
     </w:rPr>
   </w:style>
-  <w:style w:type="paragraph" w:styleId="Heading5">
+  <w:style w:type="paragraph" w:styleId="Ttulo5">
     <w:name w:val="heading 5"/>
     <w:basedOn w:val="Normal"/>
     <w:next w:val="Normal"/>
-    <w:link w:val="Heading5Char"/>
+    <w:link w:val="Ttulo5Car"/>
     <w:uiPriority w:val="9"/>
     <w:semiHidden/>
     <w:unhideWhenUsed/>
@@ -1450,11 +1605,11 @@
       <w:color w:val="0F4761" w:themeColor="accent1" w:themeShade="BF"/>
     </w:rPr>
   </w:style>
-  <w:style w:type="paragraph" w:styleId="Heading6">
+  <w:style w:type="paragraph" w:styleId="Ttulo6">
     <w:name w:val="heading 6"/>
     <w:basedOn w:val="Normal"/>
     <w:next w:val="Normal"/>
-    <w:link w:val="Heading6Char"/>
+    <w:link w:val="Ttulo6Car"/>
     <w:uiPriority w:val="9"/>
     <w:semiHidden/>
     <w:unhideWhenUsed/>
@@ -1473,11 +1628,11 @@
       <w:color w:val="595959" w:themeColor="text1" w:themeTint="A6"/>
     </w:rPr>
   </w:style>
-  <w:style w:type="paragraph" w:styleId="Heading7">
+  <w:style w:type="paragraph" w:styleId="Ttulo7">
     <w:name w:val="heading 7"/>
     <w:basedOn w:val="Normal"/>
     <w:next w:val="Normal"/>
-    <w:link w:val="Heading7Char"/>
+    <w:link w:val="Ttulo7Car"/>
     <w:uiPriority w:val="9"/>
     <w:semiHidden/>
     <w:unhideWhenUsed/>
@@ -1494,11 +1649,11 @@
       <w:color w:val="595959" w:themeColor="text1" w:themeTint="A6"/>
     </w:rPr>
   </w:style>
-  <w:style w:type="paragraph" w:styleId="Heading8">
+  <w:style w:type="paragraph" w:styleId="Ttulo8">
     <w:name w:val="heading 8"/>
     <w:basedOn w:val="Normal"/>
     <w:next w:val="Normal"/>
-    <w:link w:val="Heading8Char"/>
+    <w:link w:val="Ttulo8Car"/>
     <w:uiPriority w:val="9"/>
     <w:semiHidden/>
     <w:unhideWhenUsed/>
@@ -1517,11 +1672,11 @@
       <w:color w:val="272727" w:themeColor="text1" w:themeTint="D8"/>
     </w:rPr>
   </w:style>
-  <w:style w:type="paragraph" w:styleId="Heading9">
+  <w:style w:type="paragraph" w:styleId="Ttulo9">
     <w:name w:val="heading 9"/>
     <w:basedOn w:val="Normal"/>
     <w:next w:val="Normal"/>
-    <w:link w:val="Heading9Char"/>
+    <w:link w:val="Ttulo9Car"/>
     <w:uiPriority w:val="9"/>
     <w:semiHidden/>
     <w:unhideWhenUsed/>
@@ -1538,13 +1693,13 @@
       <w:color w:val="272727" w:themeColor="text1" w:themeTint="D8"/>
     </w:rPr>
   </w:style>
-  <w:style w:type="character" w:default="1" w:styleId="DefaultParagraphFont">
+  <w:style w:type="character" w:default="1" w:styleId="Fuentedeprrafopredeter">
     <w:name w:val="Default Paragraph Font"/>
     <w:uiPriority w:val="1"/>
     <w:semiHidden/>
     <w:unhideWhenUsed/>
   </w:style>
-  <w:style w:type="table" w:default="1" w:styleId="TableNormal">
+  <w:style w:type="table" w:default="1" w:styleId="Tablanormal">
     <w:name w:val="Normal Table"/>
     <w:uiPriority w:val="99"/>
     <w:semiHidden/>
@@ -1559,16 +1714,16 @@
       </w:tblCellMar>
     </w:tblPr>
   </w:style>
-  <w:style w:type="numbering" w:default="1" w:styleId="NoList">
+  <w:style w:type="numbering" w:default="1" w:styleId="Sinlista">
     <w:name w:val="No List"/>
     <w:uiPriority w:val="99"/>
     <w:semiHidden/>
     <w:unhideWhenUsed/>
   </w:style>
-  <w:style w:type="character" w:customStyle="1" w:styleId="Heading1Char">
-    <w:name w:val="Heading 1 Char"/>
-    <w:basedOn w:val="DefaultParagraphFont"/>
-    <w:link w:val="Heading1"/>
+  <w:style w:type="character" w:customStyle="1" w:styleId="Ttulo1Car">
+    <w:name w:val="Título 1 Car"/>
+    <w:basedOn w:val="Fuentedeprrafopredeter"/>
+    <w:link w:val="Ttulo1"/>
     <w:uiPriority w:val="9"/>
     <w:rsid w:val="004C32A8"/>
     <w:rPr>
@@ -1578,10 +1733,10 @@
       <w:szCs w:val="40"/>
     </w:rPr>
   </w:style>
-  <w:style w:type="character" w:customStyle="1" w:styleId="Heading2Char">
-    <w:name w:val="Heading 2 Char"/>
-    <w:basedOn w:val="DefaultParagraphFont"/>
-    <w:link w:val="Heading2"/>
+  <w:style w:type="character" w:customStyle="1" w:styleId="Ttulo2Car">
+    <w:name w:val="Título 2 Car"/>
+    <w:basedOn w:val="Fuentedeprrafopredeter"/>
+    <w:link w:val="Ttulo2"/>
     <w:uiPriority w:val="9"/>
     <w:semiHidden/>
     <w:rsid w:val="004C32A8"/>
@@ -1592,10 +1747,10 @@
       <w:szCs w:val="32"/>
     </w:rPr>
   </w:style>
-  <w:style w:type="character" w:customStyle="1" w:styleId="Heading3Char">
-    <w:name w:val="Heading 3 Char"/>
-    <w:basedOn w:val="DefaultParagraphFont"/>
-    <w:link w:val="Heading3"/>
+  <w:style w:type="character" w:customStyle="1" w:styleId="Ttulo3Car">
+    <w:name w:val="Título 3 Car"/>
+    <w:basedOn w:val="Fuentedeprrafopredeter"/>
+    <w:link w:val="Ttulo3"/>
     <w:uiPriority w:val="9"/>
     <w:semiHidden/>
     <w:rsid w:val="004C32A8"/>
@@ -1606,10 +1761,10 @@
       <w:szCs w:val="28"/>
     </w:rPr>
   </w:style>
-  <w:style w:type="character" w:customStyle="1" w:styleId="Heading4Char">
-    <w:name w:val="Heading 4 Char"/>
-    <w:basedOn w:val="DefaultParagraphFont"/>
-    <w:link w:val="Heading4"/>
+  <w:style w:type="character" w:customStyle="1" w:styleId="Ttulo4Car">
+    <w:name w:val="Título 4 Car"/>
+    <w:basedOn w:val="Fuentedeprrafopredeter"/>
+    <w:link w:val="Ttulo4"/>
     <w:uiPriority w:val="9"/>
     <w:semiHidden/>
     <w:rsid w:val="004C32A8"/>
@@ -1620,10 +1775,10 @@
       <w:color w:val="0F4761" w:themeColor="accent1" w:themeShade="BF"/>
     </w:rPr>
   </w:style>
-  <w:style w:type="character" w:customStyle="1" w:styleId="Heading5Char">
-    <w:name w:val="Heading 5 Char"/>
-    <w:basedOn w:val="DefaultParagraphFont"/>
-    <w:link w:val="Heading5"/>
+  <w:style w:type="character" w:customStyle="1" w:styleId="Ttulo5Car">
+    <w:name w:val="Título 5 Car"/>
+    <w:basedOn w:val="Fuentedeprrafopredeter"/>
+    <w:link w:val="Ttulo5"/>
     <w:uiPriority w:val="9"/>
     <w:semiHidden/>
     <w:rsid w:val="004C32A8"/>
@@ -1632,10 +1787,10 @@
       <w:color w:val="0F4761" w:themeColor="accent1" w:themeShade="BF"/>
     </w:rPr>
   </w:style>
-  <w:style w:type="character" w:customStyle="1" w:styleId="Heading6Char">
-    <w:name w:val="Heading 6 Char"/>
-    <w:basedOn w:val="DefaultParagraphFont"/>
-    <w:link w:val="Heading6"/>
+  <w:style w:type="character" w:customStyle="1" w:styleId="Ttulo6Car">
+    <w:name w:val="Título 6 Car"/>
+    <w:basedOn w:val="Fuentedeprrafopredeter"/>
+    <w:link w:val="Ttulo6"/>
     <w:uiPriority w:val="9"/>
     <w:semiHidden/>
     <w:rsid w:val="004C32A8"/>
@@ -1646,10 +1801,10 @@
       <w:color w:val="595959" w:themeColor="text1" w:themeTint="A6"/>
     </w:rPr>
   </w:style>
-  <w:style w:type="character" w:customStyle="1" w:styleId="Heading7Char">
-    <w:name w:val="Heading 7 Char"/>
-    <w:basedOn w:val="DefaultParagraphFont"/>
-    <w:link w:val="Heading7"/>
+  <w:style w:type="character" w:customStyle="1" w:styleId="Ttulo7Car">
+    <w:name w:val="Título 7 Car"/>
+    <w:basedOn w:val="Fuentedeprrafopredeter"/>
+    <w:link w:val="Ttulo7"/>
     <w:uiPriority w:val="9"/>
     <w:semiHidden/>
     <w:rsid w:val="004C32A8"/>
@@ -1658,10 +1813,10 @@
       <w:color w:val="595959" w:themeColor="text1" w:themeTint="A6"/>
     </w:rPr>
   </w:style>
-  <w:style w:type="character" w:customStyle="1" w:styleId="Heading8Char">
-    <w:name w:val="Heading 8 Char"/>
-    <w:basedOn w:val="DefaultParagraphFont"/>
-    <w:link w:val="Heading8"/>
+  <w:style w:type="character" w:customStyle="1" w:styleId="Ttulo8Car">
+    <w:name w:val="Título 8 Car"/>
+    <w:basedOn w:val="Fuentedeprrafopredeter"/>
+    <w:link w:val="Ttulo8"/>
     <w:uiPriority w:val="9"/>
     <w:semiHidden/>
     <w:rsid w:val="004C32A8"/>
@@ -1672,10 +1827,10 @@
       <w:color w:val="272727" w:themeColor="text1" w:themeTint="D8"/>
     </w:rPr>
   </w:style>
-  <w:style w:type="character" w:customStyle="1" w:styleId="Heading9Char">
-    <w:name w:val="Heading 9 Char"/>
-    <w:basedOn w:val="DefaultParagraphFont"/>
-    <w:link w:val="Heading9"/>
+  <w:style w:type="character" w:customStyle="1" w:styleId="Ttulo9Car">
+    <w:name w:val="Título 9 Car"/>
+    <w:basedOn w:val="Fuentedeprrafopredeter"/>
+    <w:link w:val="Ttulo9"/>
     <w:uiPriority w:val="9"/>
     <w:semiHidden/>
     <w:rsid w:val="004C32A8"/>
@@ -1684,11 +1839,11 @@
       <w:color w:val="272727" w:themeColor="text1" w:themeTint="D8"/>
     </w:rPr>
   </w:style>
-  <w:style w:type="paragraph" w:styleId="Title">
+  <w:style w:type="paragraph" w:styleId="Ttulo">
     <w:name w:val="Title"/>
     <w:basedOn w:val="Normal"/>
     <w:next w:val="Normal"/>
-    <w:link w:val="TitleChar"/>
+    <w:link w:val="TtuloCar"/>
     <w:uiPriority w:val="10"/>
     <w:qFormat/>
     <w:rsid w:val="004C32A8"/>
@@ -1704,10 +1859,10 @@
       <w:szCs w:val="56"/>
     </w:rPr>
   </w:style>
-  <w:style w:type="character" w:customStyle="1" w:styleId="TitleChar">
-    <w:name w:val="Title Char"/>
-    <w:basedOn w:val="DefaultParagraphFont"/>
-    <w:link w:val="Title"/>
+  <w:style w:type="character" w:customStyle="1" w:styleId="TtuloCar">
+    <w:name w:val="Título Car"/>
+    <w:basedOn w:val="Fuentedeprrafopredeter"/>
+    <w:link w:val="Ttulo"/>
     <w:uiPriority w:val="10"/>
     <w:rsid w:val="004C32A8"/>
     <w:rPr>
@@ -1718,11 +1873,11 @@
       <w:szCs w:val="56"/>
     </w:rPr>
   </w:style>
-  <w:style w:type="paragraph" w:styleId="Subtitle">
+  <w:style w:type="paragraph" w:styleId="Subttulo">
     <w:name w:val="Subtitle"/>
     <w:basedOn w:val="Normal"/>
     <w:next w:val="Normal"/>
-    <w:link w:val="SubtitleChar"/>
+    <w:link w:val="SubttuloCar"/>
     <w:uiPriority w:val="11"/>
     <w:qFormat/>
     <w:rsid w:val="004C32A8"/>
@@ -1739,10 +1894,10 @@
       <w:szCs w:val="28"/>
     </w:rPr>
   </w:style>
-  <w:style w:type="character" w:customStyle="1" w:styleId="SubtitleChar">
-    <w:name w:val="Subtitle Char"/>
-    <w:basedOn w:val="DefaultParagraphFont"/>
-    <w:link w:val="Subtitle"/>
+  <w:style w:type="character" w:customStyle="1" w:styleId="SubttuloCar">
+    <w:name w:val="Subtítulo Car"/>
+    <w:basedOn w:val="Fuentedeprrafopredeter"/>
+    <w:link w:val="Subttulo"/>
     <w:uiPriority w:val="11"/>
     <w:rsid w:val="004C32A8"/>
     <w:rPr>
@@ -1753,11 +1908,11 @@
       <w:szCs w:val="28"/>
     </w:rPr>
   </w:style>
-  <w:style w:type="paragraph" w:styleId="Quote">
+  <w:style w:type="paragraph" w:styleId="Cita">
     <w:name w:val="Quote"/>
     <w:basedOn w:val="Normal"/>
     <w:next w:val="Normal"/>
-    <w:link w:val="QuoteChar"/>
+    <w:link w:val="CitaCar"/>
     <w:uiPriority w:val="29"/>
     <w:qFormat/>
     <w:rsid w:val="004C32A8"/>
@@ -1771,10 +1926,10 @@
       <w:color w:val="404040" w:themeColor="text1" w:themeTint="BF"/>
     </w:rPr>
   </w:style>
-  <w:style w:type="character" w:customStyle="1" w:styleId="QuoteChar">
-    <w:name w:val="Quote Char"/>
-    <w:basedOn w:val="DefaultParagraphFont"/>
-    <w:link w:val="Quote"/>
+  <w:style w:type="character" w:customStyle="1" w:styleId="CitaCar">
+    <w:name w:val="Cita Car"/>
+    <w:basedOn w:val="Fuentedeprrafopredeter"/>
+    <w:link w:val="Cita"/>
     <w:uiPriority w:val="29"/>
     <w:rsid w:val="004C32A8"/>
     <w:rPr>
@@ -1783,7 +1938,7 @@
       <w:color w:val="404040" w:themeColor="text1" w:themeTint="BF"/>
     </w:rPr>
   </w:style>
-  <w:style w:type="paragraph" w:styleId="ListParagraph">
+  <w:style w:type="paragraph" w:styleId="Prrafodelista">
     <w:name w:val="List Paragraph"/>
     <w:basedOn w:val="Normal"/>
     <w:uiPriority w:val="34"/>
@@ -1794,9 +1949,9 @@
       <w:contextualSpacing/>
     </w:pPr>
   </w:style>
-  <w:style w:type="character" w:styleId="IntenseEmphasis">
+  <w:style w:type="character" w:styleId="nfasisintenso">
     <w:name w:val="Intense Emphasis"/>
-    <w:basedOn w:val="DefaultParagraphFont"/>
+    <w:basedOn w:val="Fuentedeprrafopredeter"/>
     <w:uiPriority w:val="21"/>
     <w:qFormat/>
     <w:rsid w:val="004C32A8"/>
@@ -1806,11 +1961,11 @@
       <w:color w:val="0F4761" w:themeColor="accent1" w:themeShade="BF"/>
     </w:rPr>
   </w:style>
-  <w:style w:type="paragraph" w:styleId="IntenseQuote">
+  <w:style w:type="paragraph" w:styleId="Citadestacada">
     <w:name w:val="Intense Quote"/>
     <w:basedOn w:val="Normal"/>
     <w:next w:val="Normal"/>
-    <w:link w:val="IntenseQuoteChar"/>
+    <w:link w:val="CitadestacadaCar"/>
     <w:uiPriority w:val="30"/>
     <w:qFormat/>
     <w:rsid w:val="004C32A8"/>
@@ -1829,10 +1984,10 @@
       <w:color w:val="0F4761" w:themeColor="accent1" w:themeShade="BF"/>
     </w:rPr>
   </w:style>
-  <w:style w:type="character" w:customStyle="1" w:styleId="IntenseQuoteChar">
-    <w:name w:val="Intense Quote Char"/>
-    <w:basedOn w:val="DefaultParagraphFont"/>
-    <w:link w:val="IntenseQuote"/>
+  <w:style w:type="character" w:customStyle="1" w:styleId="CitadestacadaCar">
+    <w:name w:val="Cita destacada Car"/>
+    <w:basedOn w:val="Fuentedeprrafopredeter"/>
+    <w:link w:val="Citadestacada"/>
     <w:uiPriority w:val="30"/>
     <w:rsid w:val="004C32A8"/>
     <w:rPr>
@@ -1841,9 +1996,9 @@
       <w:color w:val="0F4761" w:themeColor="accent1" w:themeShade="BF"/>
     </w:rPr>
   </w:style>
-  <w:style w:type="character" w:styleId="IntenseReference">
+  <w:style w:type="character" w:styleId="Referenciaintensa">
     <w:name w:val="Intense Reference"/>
-    <w:basedOn w:val="DefaultParagraphFont"/>
+    <w:basedOn w:val="Fuentedeprrafopredeter"/>
     <w:uiPriority w:val="32"/>
     <w:qFormat/>
     <w:rsid w:val="004C32A8"/>

</xml_diff>